<commit_message>
Update portfolio resume links
</commit_message>
<xml_diff>
--- a/public/Isaev_Bogdan.docx
+++ b/public/Isaev_Bogdan.docx
@@ -1,6 +1,6 @@
 
 <file path=word/document.xml><?xml version="1.0" encoding="utf-8"?>
-<w:document xmlns:wpc="http://schemas.microsoft.com/office/word/2010/wordprocessingCanvas" xmlns:cx="http://schemas.microsoft.com/office/drawing/2014/chartex" xmlns:cx1="http://schemas.microsoft.com/office/drawing/2015/9/8/chartex" xmlns:cx2="http://schemas.microsoft.com/office/drawing/2015/10/21/chartex" xmlns:cx3="http://schemas.microsoft.com/office/drawing/2016/5/9/chartex" xmlns:cx4="http://schemas.microsoft.com/office/drawing/2016/5/10/chartex" xmlns:cx5="http://schemas.microsoft.com/office/drawing/2016/5/11/chartex" xmlns:cx6="http://schemas.microsoft.com/office/drawing/2016/5/12/chartex" xmlns:cx7="http://schemas.microsoft.com/office/drawing/2016/5/13/chartex" xmlns:cx8="http://schemas.microsoft.com/office/drawing/2016/5/14/chartex" xmlns:mc="http://schemas.openxmlformats.org/markup-compatibility/2006" xmlns:aink="http://schemas.microsoft.com/office/drawing/2016/ink" xmlns:am3d="http://schemas.microsoft.com/office/drawing/2017/model3d" xmlns:o="urn:schemas-microsoft-com:office:office" xmlns:oel="http://schemas.microsoft.com/office/2019/extlst" xmlns:r="http://schemas.openxmlformats.org/officeDocument/2006/relationships" xmlns:m="http://schemas.openxmlformats.org/officeDocument/2006/math" xmlns:v="urn:schemas-microsoft-com:vml" xmlns:wp14="http://schemas.microsoft.com/office/word/2010/wordprocessingDrawing" xmlns:wp="http://schemas.openxmlformats.org/drawingml/2006/wordprocessingDrawing" xmlns:w10="urn:schemas-microsoft-com:office:word" xmlns:w="http://schemas.openxmlformats.org/wordprocessingml/2006/main" xmlns:w14="http://schemas.microsoft.com/office/word/2010/wordml" xmlns:w15="http://schemas.microsoft.com/office/word/2012/wordml" xmlns:w16cex="http://schemas.microsoft.com/office/word/2018/wordml/cex" xmlns:w16cid="http://schemas.microsoft.com/office/word/2016/wordml/cid" xmlns:w16="http://schemas.microsoft.com/office/word/2018/wordml" xmlns:w16du="http://schemas.microsoft.com/office/word/2023/wordml/word16du" xmlns:w16sdtdh="http://schemas.microsoft.com/office/word/2020/wordml/sdtdatahash" xmlns:w16sdtfl="http://schemas.microsoft.com/office/word/2024/wordml/sdtformatlock" xmlns:w16se="http://schemas.microsoft.com/office/word/2015/wordml/symex" xmlns:wpg="http://schemas.microsoft.com/office/word/2010/wordprocessingGroup" xmlns:wpi="http://schemas.microsoft.com/office/word/2010/wordprocessingInk" xmlns:wne="http://schemas.microsoft.com/office/word/2006/wordml" xmlns:wps="http://schemas.microsoft.com/office/word/2010/wordprocessingShape" mc:Ignorable="w14 w15 w16se w16cid w16 w16cex w16sdtdh w16sdtfl w16du wp14">
+<w:document xmlns:wpc="http://schemas.microsoft.com/office/word/2010/wordprocessingCanvas" xmlns:cx="http://schemas.microsoft.com/office/drawing/2014/chartex" xmlns:cx1="http://schemas.microsoft.com/office/drawing/2015/9/8/chartex" xmlns:cx2="http://schemas.microsoft.com/office/drawing/2015/10/21/chartex" xmlns:cx3="http://schemas.microsoft.com/office/drawing/2016/5/9/chartex" xmlns:cx4="http://schemas.microsoft.com/office/drawing/2016/5/10/chartex" xmlns:cx5="http://schemas.microsoft.com/office/drawing/2016/5/11/chartex" xmlns:cx6="http://schemas.microsoft.com/office/drawing/2016/5/12/chartex" xmlns:cx7="http://schemas.microsoft.com/office/drawing/2016/5/13/chartex" xmlns:cx8="http://schemas.microsoft.com/office/drawing/2016/5/14/chartex" xmlns:mc="http://schemas.openxmlformats.org/markup-compatibility/2006" xmlns:aink="http://schemas.microsoft.com/office/drawing/2016/ink" xmlns:am3d="http://schemas.microsoft.com/office/drawing/2017/model3d" xmlns:o="urn:schemas-microsoft-com:office:office" xmlns:oel="http://schemas.microsoft.com/office/2019/extlst" xmlns:r="http://schemas.openxmlformats.org/officeDocument/2006/relationships" xmlns:m="http://schemas.openxmlformats.org/officeDocument/2006/math" xmlns:v="urn:schemas-microsoft-com:vml" xmlns:wp14="http://schemas.microsoft.com/office/word/2010/wordprocessingDrawing" xmlns:wp="http://schemas.openxmlformats.org/drawingml/2006/wordprocessingDrawing" xmlns:w10="urn:schemas-microsoft-com:office:word" xmlns:w="http://schemas.openxmlformats.org/wordprocessingml/2006/main" xmlns:w14="http://schemas.microsoft.com/office/word/2010/wordml" xmlns:w15="http://schemas.microsoft.com/office/word/2012/wordml" xmlns:w16cei="http://schemas.microsoft.com/office/word/2026/wordml/cei" xmlns:w16cex="http://schemas.microsoft.com/office/word/2018/wordml/cex" xmlns:w16cid="http://schemas.microsoft.com/office/word/2016/wordml/cid" xmlns:w16="http://schemas.microsoft.com/office/word/2018/wordml" xmlns:w16du="http://schemas.microsoft.com/office/word/2023/wordml/word16du" xmlns:w16sdtdh="http://schemas.microsoft.com/office/word/2020/wordml/sdtdatahash" xmlns:w16sdtfl="http://schemas.microsoft.com/office/word/2024/wordml/sdtformatlock" xmlns:w16se="http://schemas.microsoft.com/office/word/2015/wordml/symex" xmlns:wpg="http://schemas.microsoft.com/office/word/2010/wordprocessingGroup" xmlns:wpi="http://schemas.microsoft.com/office/word/2010/wordprocessingInk" xmlns:wne="http://schemas.microsoft.com/office/word/2006/wordml" xmlns:wps="http://schemas.microsoft.com/office/word/2010/wordprocessingShape" mc:Ignorable="w14 w15 w16se w16cid w16 w16cex w16sdtdh w16sdtfl w16du wp14">
   <w:body>
     <w:tbl>
       <w:tblPr>
@@ -198,6 +198,7 @@
               <w:spacing w:line="360" w:lineRule="auto"/>
               <w:rPr>
                 <w:rFonts w:ascii="Segoe UI" w:hAnsi="Segoe UI" w:cs="Segoe UI"/>
+                <w:lang w:val="en-US"/>
               </w:rPr>
             </w:pPr>
             <w:r>
@@ -258,6 +259,7 @@
               <w:spacing w:line="360" w:lineRule="auto"/>
               <w:rPr>
                 <w:rFonts w:ascii="Segoe UI" w:hAnsi="Segoe UI" w:cs="Segoe UI"/>
+                <w:lang w:val="en-US"/>
               </w:rPr>
             </w:pPr>
             <w:r>
@@ -265,12 +267,14 @@
                 <w:rFonts w:ascii="Segoe UI" w:hAnsi="Segoe UI" w:cs="Segoe UI"/>
                 <w:b/>
                 <w:bCs/>
+                <w:lang w:val="en-US"/>
               </w:rPr>
               <w:t>Telegram</w:t>
             </w:r>
             <w:r>
               <w:rPr>
                 <w:rFonts w:ascii="Segoe UI" w:hAnsi="Segoe UI" w:cs="Segoe UI"/>
+                <w:lang w:val="en-US"/>
               </w:rPr>
               <w:t xml:space="preserve">: </w:t>
             </w:r>
@@ -279,22 +283,9 @@
                 <w:rPr>
                   <w:rStyle w:val="ad"/>
                   <w:rFonts w:ascii="Segoe UI" w:hAnsi="Segoe UI" w:cs="Segoe UI"/>
+                  <w:lang w:val="en-US"/>
                 </w:rPr>
-                <w:t>@red</w:t>
-              </w:r>
-              <w:r>
-                <w:rPr>
-                  <w:rStyle w:val="ad"/>
-                  <w:rFonts w:ascii="Segoe UI" w:hAnsi="Segoe UI" w:cs="Segoe UI"/>
-                </w:rPr>
-                <w:t>w</w:t>
-              </w:r>
-              <w:r>
-                <w:rPr>
-                  <w:rStyle w:val="ad"/>
-                  <w:rFonts w:ascii="Segoe UI" w:hAnsi="Segoe UI" w:cs="Segoe UI"/>
-                </w:rPr>
-                <w:t>ick</w:t>
+                <w:t>@redwick</w:t>
               </w:r>
             </w:hyperlink>
           </w:p>
@@ -334,37 +325,8 @@
                   <w:u w:val="single"/>
                   <w:lang w:val="en-US"/>
                 </w:rPr>
-                <w:t>github.com/</w:t>
+                <w:t>github.com/redwick</w:t>
               </w:r>
-              <w:proofErr w:type="spellStart"/>
-              <w:r>
-                <w:rPr>
-                  <w:rFonts w:ascii="Segoe UI" w:hAnsi="Segoe UI" w:cs="Segoe UI"/>
-                  <w:color w:val="0000FF"/>
-                  <w:u w:val="single"/>
-                  <w:lang w:val="en-US"/>
-                </w:rPr>
-                <w:t>re</w:t>
-              </w:r>
-              <w:r>
-                <w:rPr>
-                  <w:rFonts w:ascii="Segoe UI" w:hAnsi="Segoe UI" w:cs="Segoe UI"/>
-                  <w:color w:val="0000FF"/>
-                  <w:u w:val="single"/>
-                  <w:lang w:val="en-US"/>
-                </w:rPr>
-                <w:t>d</w:t>
-              </w:r>
-              <w:r>
-                <w:rPr>
-                  <w:rFonts w:ascii="Segoe UI" w:hAnsi="Segoe UI" w:cs="Segoe UI"/>
-                  <w:color w:val="0000FF"/>
-                  <w:u w:val="single"/>
-                  <w:lang w:val="en-US"/>
-                </w:rPr>
-                <w:t>wick</w:t>
-              </w:r>
-              <w:proofErr w:type="spellEnd"/>
             </w:hyperlink>
             <w:r>
               <w:rPr>
@@ -381,7 +343,7 @@
                   <w:u w:val="single"/>
                   <w:lang w:val="en-US"/>
                 </w:rPr>
-                <w:t>redwick.ru</w:t>
+                <w:t>redwick.ru/cv/</w:t>
               </w:r>
             </w:hyperlink>
           </w:p>
@@ -508,27 +470,7 @@
           <w:lang w:val="en-US" w:eastAsia="ru-RU"/>
           <w14:ligatures w14:val="none"/>
         </w:rPr>
-        <w:t xml:space="preserve"> Angular (v2-19), </w:t>
-      </w:r>
-      <w:proofErr w:type="spellStart"/>
-      <w:r>
-        <w:rPr>
-          <w:rFonts w:ascii="Segoe UI" w:eastAsia="Times New Roman" w:hAnsi="Segoe UI" w:cs="Segoe UI"/>
-          <w:kern w:val="0"/>
-          <w:lang w:val="en-US" w:eastAsia="ru-RU"/>
-          <w14:ligatures w14:val="none"/>
-        </w:rPr>
-        <w:t>RxJS</w:t>
-      </w:r>
-      <w:proofErr w:type="spellEnd"/>
-      <w:r>
-        <w:rPr>
-          <w:rFonts w:ascii="Segoe UI" w:eastAsia="Times New Roman" w:hAnsi="Segoe UI" w:cs="Segoe UI"/>
-          <w:kern w:val="0"/>
-          <w:lang w:val="en-US" w:eastAsia="ru-RU"/>
-          <w14:ligatures w14:val="none"/>
-        </w:rPr>
-        <w:t>, TypeScript, Ionic (Mobile), Tailwind CSS, Bootstrap, SCSS.</w:t>
+        <w:t xml:space="preserve"> Angular (v2-19), RxJS, TypeScript, Ionic (Mobile), Tailwind CSS, Bootstrap, SCSS.</w:t>
       </w:r>
     </w:p>
     <w:p>
@@ -563,27 +505,7 @@
           <w:lang w:val="en-US" w:eastAsia="ru-RU"/>
           <w14:ligatures w14:val="none"/>
         </w:rPr>
-        <w:t xml:space="preserve"> Rust (Axum, Tokio), Scala (Akka/Pekko), </w:t>
-      </w:r>
-      <w:proofErr w:type="spellStart"/>
-      <w:r>
-        <w:rPr>
-          <w:rFonts w:ascii="Segoe UI" w:eastAsia="Times New Roman" w:hAnsi="Segoe UI" w:cs="Segoe UI"/>
-          <w:kern w:val="0"/>
-          <w:lang w:val="en-US" w:eastAsia="ru-RU"/>
-          <w14:ligatures w14:val="none"/>
-        </w:rPr>
-        <w:t>NestJS</w:t>
-      </w:r>
-      <w:proofErr w:type="spellEnd"/>
-      <w:r>
-        <w:rPr>
-          <w:rFonts w:ascii="Segoe UI" w:eastAsia="Times New Roman" w:hAnsi="Segoe UI" w:cs="Segoe UI"/>
-          <w:kern w:val="0"/>
-          <w:lang w:val="en-US" w:eastAsia="ru-RU"/>
-          <w14:ligatures w14:val="none"/>
-        </w:rPr>
-        <w:t>, C# (.NET Core/Framework), Java.</w:t>
+        <w:t xml:space="preserve"> Rust (Axum, Tokio), Scala (Akka/Pekko), NestJS, C# (.NET Core/Framework), Java.</w:t>
       </w:r>
     </w:p>
     <w:p>
@@ -618,27 +540,7 @@
           <w:lang w:val="en-US" w:eastAsia="ru-RU"/>
           <w14:ligatures w14:val="none"/>
         </w:rPr>
-        <w:t xml:space="preserve"> PostgreSQL, MongoDB, Oracle, Redis, S3 (</w:t>
-      </w:r>
-      <w:proofErr w:type="spellStart"/>
-      <w:r>
-        <w:rPr>
-          <w:rFonts w:ascii="Segoe UI" w:eastAsia="Times New Roman" w:hAnsi="Segoe UI" w:cs="Segoe UI"/>
-          <w:kern w:val="0"/>
-          <w:lang w:val="en-US" w:eastAsia="ru-RU"/>
-          <w14:ligatures w14:val="none"/>
-        </w:rPr>
-        <w:t>MinIO</w:t>
-      </w:r>
-      <w:proofErr w:type="spellEnd"/>
-      <w:r>
-        <w:rPr>
-          <w:rFonts w:ascii="Segoe UI" w:eastAsia="Times New Roman" w:hAnsi="Segoe UI" w:cs="Segoe UI"/>
-          <w:kern w:val="0"/>
-          <w:lang w:val="en-US" w:eastAsia="ru-RU"/>
-          <w14:ligatures w14:val="none"/>
-        </w:rPr>
-        <w:t>).</w:t>
+        <w:t xml:space="preserve"> PostgreSQL, MongoDB, Oracle, Redis, S3 (MinIO).</w:t>
       </w:r>
     </w:p>
     <w:p>
@@ -708,47 +610,7 @@
           <w:lang w:val="en-US" w:eastAsia="ru-RU"/>
           <w14:ligatures w14:val="none"/>
         </w:rPr>
-        <w:t xml:space="preserve"> </w:t>
-      </w:r>
-      <w:proofErr w:type="spellStart"/>
-      <w:r>
-        <w:rPr>
-          <w:rFonts w:ascii="Segoe UI" w:eastAsia="Times New Roman" w:hAnsi="Segoe UI" w:cs="Segoe UI"/>
-          <w:kern w:val="0"/>
-          <w:lang w:val="en-US" w:eastAsia="ru-RU"/>
-          <w14:ligatures w14:val="none"/>
-        </w:rPr>
-        <w:t>Keycloak</w:t>
-      </w:r>
-      <w:proofErr w:type="spellEnd"/>
-      <w:r>
-        <w:rPr>
-          <w:rFonts w:ascii="Segoe UI" w:eastAsia="Times New Roman" w:hAnsi="Segoe UI" w:cs="Segoe UI"/>
-          <w:kern w:val="0"/>
-          <w:lang w:val="en-US" w:eastAsia="ru-RU"/>
-          <w14:ligatures w14:val="none"/>
-        </w:rPr>
-        <w:t xml:space="preserve"> SSO, OIDC, VPN (</w:t>
-      </w:r>
-      <w:proofErr w:type="spellStart"/>
-      <w:r>
-        <w:rPr>
-          <w:rFonts w:ascii="Segoe UI" w:eastAsia="Times New Roman" w:hAnsi="Segoe UI" w:cs="Segoe UI"/>
-          <w:kern w:val="0"/>
-          <w:lang w:val="en-US" w:eastAsia="ru-RU"/>
-          <w14:ligatures w14:val="none"/>
-        </w:rPr>
-        <w:t>WireGuard</w:t>
-      </w:r>
-      <w:proofErr w:type="spellEnd"/>
-      <w:r>
-        <w:rPr>
-          <w:rFonts w:ascii="Segoe UI" w:eastAsia="Times New Roman" w:hAnsi="Segoe UI" w:cs="Segoe UI"/>
-          <w:kern w:val="0"/>
-          <w:lang w:val="en-US" w:eastAsia="ru-RU"/>
-          <w14:ligatures w14:val="none"/>
-        </w:rPr>
-        <w:t>/OpenVPN), Firewall.</w:t>
+        <w:t xml:space="preserve"> Keycloak SSO, OIDC, VPN (WireGuard/OpenVPN), Firewall.</w:t>
       </w:r>
     </w:p>
     <w:p>
@@ -888,47 +750,7 @@
           <w:lang w:val="en-US" w:eastAsia="ru-RU"/>
           <w14:ligatures w14:val="none"/>
         </w:rPr>
-        <w:t xml:space="preserve"> Linux Server (Ubuntu), Matrix Synapse, </w:t>
-      </w:r>
-      <w:proofErr w:type="spellStart"/>
-      <w:r>
-        <w:rPr>
-          <w:rFonts w:ascii="Segoe UI" w:eastAsia="Times New Roman" w:hAnsi="Segoe UI" w:cs="Segoe UI"/>
-          <w:kern w:val="0"/>
-          <w:lang w:val="en-US" w:eastAsia="ru-RU"/>
-          <w14:ligatures w14:val="none"/>
-        </w:rPr>
-        <w:t>iRedMail</w:t>
-      </w:r>
-      <w:proofErr w:type="spellEnd"/>
-      <w:r>
-        <w:rPr>
-          <w:rFonts w:ascii="Segoe UI" w:eastAsia="Times New Roman" w:hAnsi="Segoe UI" w:cs="Segoe UI"/>
-          <w:kern w:val="0"/>
-          <w:lang w:val="en-US" w:eastAsia="ru-RU"/>
-          <w14:ligatures w14:val="none"/>
-        </w:rPr>
-        <w:t xml:space="preserve">, Samba AD DC, </w:t>
-      </w:r>
-      <w:proofErr w:type="spellStart"/>
-      <w:r>
-        <w:rPr>
-          <w:rFonts w:ascii="Segoe UI" w:eastAsia="Times New Roman" w:hAnsi="Segoe UI" w:cs="Segoe UI"/>
-          <w:kern w:val="0"/>
-          <w:lang w:val="en-US" w:eastAsia="ru-RU"/>
-          <w14:ligatures w14:val="none"/>
-        </w:rPr>
-        <w:t>NextCloud</w:t>
-      </w:r>
-      <w:proofErr w:type="spellEnd"/>
-      <w:r>
-        <w:rPr>
-          <w:rFonts w:ascii="Segoe UI" w:eastAsia="Times New Roman" w:hAnsi="Segoe UI" w:cs="Segoe UI"/>
-          <w:kern w:val="0"/>
-          <w:lang w:val="en-US" w:eastAsia="ru-RU"/>
-          <w14:ligatures w14:val="none"/>
-        </w:rPr>
-        <w:t>.</w:t>
+        <w:t xml:space="preserve"> Linux Server (Ubuntu), Matrix Synapse, iRedMail, Samba AD DC, NextCloud.</w:t>
       </w:r>
     </w:p>
     <w:p>
@@ -1085,7 +907,6 @@
           <w14:ligatures w14:val="none"/>
         </w:rPr>
       </w:pPr>
-      <w:proofErr w:type="spellStart"/>
       <w:r>
         <w:rPr>
           <w:rFonts w:ascii="Segoe UI" w:eastAsia="Times New Roman" w:hAnsi="Segoe UI" w:cs="Segoe UI"/>
@@ -1095,33 +916,8 @@
           <w:lang w:eastAsia="ru-RU"/>
           <w14:ligatures w14:val="none"/>
         </w:rPr>
-        <w:t>Nov</w:t>
-      </w:r>
-      <w:proofErr w:type="spellEnd"/>
-      <w:r>
-        <w:rPr>
-          <w:rFonts w:ascii="Segoe UI" w:eastAsia="Times New Roman" w:hAnsi="Segoe UI" w:cs="Segoe UI"/>
-          <w:i/>
-          <w:iCs/>
-          <w:kern w:val="0"/>
-          <w:lang w:eastAsia="ru-RU"/>
-          <w14:ligatures w14:val="none"/>
-        </w:rPr>
-        <w:t xml:space="preserve"> 2024 — </w:t>
-      </w:r>
-      <w:proofErr w:type="spellStart"/>
-      <w:r>
-        <w:rPr>
-          <w:rFonts w:ascii="Segoe UI" w:eastAsia="Times New Roman" w:hAnsi="Segoe UI" w:cs="Segoe UI"/>
-          <w:i/>
-          <w:iCs/>
-          <w:kern w:val="0"/>
-          <w:lang w:eastAsia="ru-RU"/>
-          <w14:ligatures w14:val="none"/>
-        </w:rPr>
-        <w:t>Present</w:t>
-      </w:r>
-      <w:proofErr w:type="spellEnd"/>
+        <w:t>Nov 2024 — Present</w:t>
+      </w:r>
     </w:p>
     <w:p>
       <w:pPr>
@@ -1142,31 +938,7 @@
           <w:lang w:eastAsia="ru-RU"/>
           <w14:ligatures w14:val="none"/>
         </w:rPr>
-        <w:t xml:space="preserve">Key </w:t>
-      </w:r>
-      <w:proofErr w:type="spellStart"/>
-      <w:r>
-        <w:rPr>
-          <w:rFonts w:ascii="Segoe UI" w:eastAsia="Times New Roman" w:hAnsi="Segoe UI" w:cs="Segoe UI"/>
-          <w:b/>
-          <w:bCs/>
-          <w:kern w:val="0"/>
-          <w:lang w:eastAsia="ru-RU"/>
-          <w14:ligatures w14:val="none"/>
-        </w:rPr>
-        <w:t>Projects</w:t>
-      </w:r>
-      <w:proofErr w:type="spellEnd"/>
-      <w:r>
-        <w:rPr>
-          <w:rFonts w:ascii="Segoe UI" w:eastAsia="Times New Roman" w:hAnsi="Segoe UI" w:cs="Segoe UI"/>
-          <w:b/>
-          <w:bCs/>
-          <w:kern w:val="0"/>
-          <w:lang w:eastAsia="ru-RU"/>
-          <w14:ligatures w14:val="none"/>
-        </w:rPr>
-        <w:t>:</w:t>
+        <w:t>Key Projects:</w:t>
       </w:r>
     </w:p>
     <w:p>
@@ -1438,7 +1210,6 @@
           <w14:ligatures w14:val="none"/>
         </w:rPr>
       </w:pPr>
-      <w:proofErr w:type="spellStart"/>
       <w:r>
         <w:rPr>
           <w:rFonts w:ascii="Segoe UI" w:eastAsia="Times New Roman" w:hAnsi="Segoe UI" w:cs="Segoe UI"/>
@@ -1448,91 +1219,7 @@
           <w:lang w:eastAsia="ru-RU"/>
           <w14:ligatures w14:val="none"/>
         </w:rPr>
-        <w:t>Feb</w:t>
-      </w:r>
-      <w:proofErr w:type="spellEnd"/>
-      <w:r>
-        <w:rPr>
-          <w:rFonts w:ascii="Segoe UI" w:eastAsia="Times New Roman" w:hAnsi="Segoe UI" w:cs="Segoe UI"/>
-          <w:i/>
-          <w:iCs/>
-          <w:kern w:val="0"/>
-          <w:lang w:eastAsia="ru-RU"/>
-          <w14:ligatures w14:val="none"/>
-        </w:rPr>
-        <w:t xml:space="preserve"> 2018 — </w:t>
-      </w:r>
-      <w:proofErr w:type="spellStart"/>
-      <w:r>
-        <w:rPr>
-          <w:rFonts w:ascii="Segoe UI" w:eastAsia="Times New Roman" w:hAnsi="Segoe UI" w:cs="Segoe UI"/>
-          <w:i/>
-          <w:iCs/>
-          <w:kern w:val="0"/>
-          <w:lang w:eastAsia="ru-RU"/>
-          <w14:ligatures w14:val="none"/>
-        </w:rPr>
-        <w:t>Nov</w:t>
-      </w:r>
-      <w:proofErr w:type="spellEnd"/>
-      <w:r>
-        <w:rPr>
-          <w:rFonts w:ascii="Segoe UI" w:eastAsia="Times New Roman" w:hAnsi="Segoe UI" w:cs="Segoe UI"/>
-          <w:i/>
-          <w:iCs/>
-          <w:kern w:val="0"/>
-          <w:lang w:eastAsia="ru-RU"/>
-          <w14:ligatures w14:val="none"/>
-        </w:rPr>
-        <w:t xml:space="preserve"> 2024 (6 </w:t>
-      </w:r>
-      <w:proofErr w:type="spellStart"/>
-      <w:r>
-        <w:rPr>
-          <w:rFonts w:ascii="Segoe UI" w:eastAsia="Times New Roman" w:hAnsi="Segoe UI" w:cs="Segoe UI"/>
-          <w:i/>
-          <w:iCs/>
-          <w:kern w:val="0"/>
-          <w:lang w:eastAsia="ru-RU"/>
-          <w14:ligatures w14:val="none"/>
-        </w:rPr>
-        <w:t>years</w:t>
-      </w:r>
-      <w:proofErr w:type="spellEnd"/>
-      <w:r>
-        <w:rPr>
-          <w:rFonts w:ascii="Segoe UI" w:eastAsia="Times New Roman" w:hAnsi="Segoe UI" w:cs="Segoe UI"/>
-          <w:i/>
-          <w:iCs/>
-          <w:kern w:val="0"/>
-          <w:lang w:eastAsia="ru-RU"/>
-          <w14:ligatures w14:val="none"/>
-        </w:rPr>
-        <w:t xml:space="preserve"> 9 </w:t>
-      </w:r>
-      <w:proofErr w:type="spellStart"/>
-      <w:r>
-        <w:rPr>
-          <w:rFonts w:ascii="Segoe UI" w:eastAsia="Times New Roman" w:hAnsi="Segoe UI" w:cs="Segoe UI"/>
-          <w:i/>
-          <w:iCs/>
-          <w:kern w:val="0"/>
-          <w:lang w:eastAsia="ru-RU"/>
-          <w14:ligatures w14:val="none"/>
-        </w:rPr>
-        <w:t>months</w:t>
-      </w:r>
-      <w:proofErr w:type="spellEnd"/>
-      <w:r>
-        <w:rPr>
-          <w:rFonts w:ascii="Segoe UI" w:eastAsia="Times New Roman" w:hAnsi="Segoe UI" w:cs="Segoe UI"/>
-          <w:i/>
-          <w:iCs/>
-          <w:kern w:val="0"/>
-          <w:lang w:eastAsia="ru-RU"/>
-          <w14:ligatures w14:val="none"/>
-        </w:rPr>
-        <w:t>)</w:t>
+        <w:t>Feb 2018 — Nov 2024 (6 years 9 months)</w:t>
       </w:r>
     </w:p>
     <w:p>
@@ -1762,67 +1449,7 @@
           <w:lang w:val="en-US" w:eastAsia="ru-RU"/>
           <w14:ligatures w14:val="none"/>
         </w:rPr>
-        <w:t xml:space="preserve"> Deployed a self-managed ecosystem of services from scratch (</w:t>
-      </w:r>
-      <w:proofErr w:type="spellStart"/>
-      <w:r>
-        <w:rPr>
-          <w:rFonts w:ascii="Segoe UI" w:eastAsia="Times New Roman" w:hAnsi="Segoe UI" w:cs="Segoe UI"/>
-          <w:kern w:val="0"/>
-          <w:lang w:val="en-US" w:eastAsia="ru-RU"/>
-          <w14:ligatures w14:val="none"/>
-        </w:rPr>
-        <w:t>Rocket.Chat</w:t>
-      </w:r>
-      <w:proofErr w:type="spellEnd"/>
-      <w:r>
-        <w:rPr>
-          <w:rFonts w:ascii="Segoe UI" w:eastAsia="Times New Roman" w:hAnsi="Segoe UI" w:cs="Segoe UI"/>
-          <w:kern w:val="0"/>
-          <w:lang w:val="en-US" w:eastAsia="ru-RU"/>
-          <w14:ligatures w14:val="none"/>
-        </w:rPr>
-        <w:t xml:space="preserve">, </w:t>
-      </w:r>
-      <w:proofErr w:type="spellStart"/>
-      <w:r>
-        <w:rPr>
-          <w:rFonts w:ascii="Segoe UI" w:eastAsia="Times New Roman" w:hAnsi="Segoe UI" w:cs="Segoe UI"/>
-          <w:kern w:val="0"/>
-          <w:lang w:val="en-US" w:eastAsia="ru-RU"/>
-          <w14:ligatures w14:val="none"/>
-        </w:rPr>
-        <w:t>iRedMail</w:t>
-      </w:r>
-      <w:proofErr w:type="spellEnd"/>
-      <w:r>
-        <w:rPr>
-          <w:rFonts w:ascii="Segoe UI" w:eastAsia="Times New Roman" w:hAnsi="Segoe UI" w:cs="Segoe UI"/>
-          <w:kern w:val="0"/>
-          <w:lang w:val="en-US" w:eastAsia="ru-RU"/>
-          <w14:ligatures w14:val="none"/>
-        </w:rPr>
-        <w:t xml:space="preserve">, </w:t>
-      </w:r>
-      <w:proofErr w:type="spellStart"/>
-      <w:r>
-        <w:rPr>
-          <w:rFonts w:ascii="Segoe UI" w:eastAsia="Times New Roman" w:hAnsi="Segoe UI" w:cs="Segoe UI"/>
-          <w:kern w:val="0"/>
-          <w:lang w:val="en-US" w:eastAsia="ru-RU"/>
-          <w14:ligatures w14:val="none"/>
-        </w:rPr>
-        <w:t>Keycloak</w:t>
-      </w:r>
-      <w:proofErr w:type="spellEnd"/>
-      <w:r>
-        <w:rPr>
-          <w:rFonts w:ascii="Segoe UI" w:eastAsia="Times New Roman" w:hAnsi="Segoe UI" w:cs="Segoe UI"/>
-          <w:kern w:val="0"/>
-          <w:lang w:val="en-US" w:eastAsia="ru-RU"/>
-          <w14:ligatures w14:val="none"/>
-        </w:rPr>
-        <w:t>, GitLab).</w:t>
+        <w:t xml:space="preserve"> Deployed a self-managed ecosystem of services from scratch (Rocket.Chat, iRedMail, Keycloak, GitLab).</w:t>
       </w:r>
     </w:p>
     <w:p>
@@ -1935,6 +1562,7 @@
           <w:szCs w:val="24"/>
           <w:lang w:val="en-US"/>
         </w:rPr>
+        <w:lastRenderedPageBreak/>
         <w:t>Education</w:t>
       </w:r>
     </w:p>
@@ -2104,7 +1732,7 @@
           <w:szCs w:val="24"/>
         </w:rPr>
         <w:pict w14:anchorId="5A5F8687">
-          <v:rect id="_x0000_i1047" style="width:0;height:1.5pt" o:hralign="center" o:hrstd="t" o:hr="t" fillcolor="#a0a0a0" stroked="f"/>
+          <v:rect id="_x0000_i1030" style="width:0;height:1.5pt" o:hralign="center" o:hrstd="t" o:hr="t" fillcolor="#a0a0a0" stroked="f"/>
         </w:pict>
       </w:r>
     </w:p>
@@ -2119,7 +1747,7 @@
 </file>
 
 <file path=word/numbering.xml><?xml version="1.0" encoding="utf-8"?>
-<w:numbering xmlns:wpc="http://schemas.microsoft.com/office/word/2010/wordprocessingCanvas" xmlns:cx="http://schemas.microsoft.com/office/drawing/2014/chartex" xmlns:cx1="http://schemas.microsoft.com/office/drawing/2015/9/8/chartex" xmlns:cx2="http://schemas.microsoft.com/office/drawing/2015/10/21/chartex" xmlns:cx3="http://schemas.microsoft.com/office/drawing/2016/5/9/chartex" xmlns:cx4="http://schemas.microsoft.com/office/drawing/2016/5/10/chartex" xmlns:cx5="http://schemas.microsoft.com/office/drawing/2016/5/11/chartex" xmlns:cx6="http://schemas.microsoft.com/office/drawing/2016/5/12/chartex" xmlns:cx7="http://schemas.microsoft.com/office/drawing/2016/5/13/chartex" xmlns:cx8="http://schemas.microsoft.com/office/drawing/2016/5/14/chartex" xmlns:mc="http://schemas.openxmlformats.org/markup-compatibility/2006" xmlns:aink="http://schemas.microsoft.com/office/drawing/2016/ink" xmlns:am3d="http://schemas.microsoft.com/office/drawing/2017/model3d" xmlns:o="urn:schemas-microsoft-com:office:office" xmlns:oel="http://schemas.microsoft.com/office/2019/extlst" xmlns:r="http://schemas.openxmlformats.org/officeDocument/2006/relationships" xmlns:m="http://schemas.openxmlformats.org/officeDocument/2006/math" xmlns:v="urn:schemas-microsoft-com:vml" xmlns:wp14="http://schemas.microsoft.com/office/word/2010/wordprocessingDrawing" xmlns:wp="http://schemas.openxmlformats.org/drawingml/2006/wordprocessingDrawing" xmlns:w10="urn:schemas-microsoft-com:office:word" xmlns:w="http://schemas.openxmlformats.org/wordprocessingml/2006/main" xmlns:w14="http://schemas.microsoft.com/office/word/2010/wordml" xmlns:w15="http://schemas.microsoft.com/office/word/2012/wordml" xmlns:w16cex="http://schemas.microsoft.com/office/word/2018/wordml/cex" xmlns:w16cid="http://schemas.microsoft.com/office/word/2016/wordml/cid" xmlns:w16="http://schemas.microsoft.com/office/word/2018/wordml" xmlns:w16du="http://schemas.microsoft.com/office/word/2023/wordml/word16du" xmlns:w16sdtdh="http://schemas.microsoft.com/office/word/2020/wordml/sdtdatahash" xmlns:w16sdtfl="http://schemas.microsoft.com/office/word/2024/wordml/sdtformatlock" xmlns:w16se="http://schemas.microsoft.com/office/word/2015/wordml/symex" xmlns:wpg="http://schemas.microsoft.com/office/word/2010/wordprocessingGroup" xmlns:wpi="http://schemas.microsoft.com/office/word/2010/wordprocessingInk" xmlns:wne="http://schemas.microsoft.com/office/word/2006/wordml" xmlns:wps="http://schemas.microsoft.com/office/word/2010/wordprocessingShape" mc:Ignorable="w14 w15 w16se w16cid w16 w16cex w16sdtdh w16sdtfl w16du wp14">
+<w:numbering xmlns:wpc="http://schemas.microsoft.com/office/word/2010/wordprocessingCanvas" xmlns:cx="http://schemas.microsoft.com/office/drawing/2014/chartex" xmlns:cx1="http://schemas.microsoft.com/office/drawing/2015/9/8/chartex" xmlns:cx2="http://schemas.microsoft.com/office/drawing/2015/10/21/chartex" xmlns:cx3="http://schemas.microsoft.com/office/drawing/2016/5/9/chartex" xmlns:cx4="http://schemas.microsoft.com/office/drawing/2016/5/10/chartex" xmlns:cx5="http://schemas.microsoft.com/office/drawing/2016/5/11/chartex" xmlns:cx6="http://schemas.microsoft.com/office/drawing/2016/5/12/chartex" xmlns:cx7="http://schemas.microsoft.com/office/drawing/2016/5/13/chartex" xmlns:cx8="http://schemas.microsoft.com/office/drawing/2016/5/14/chartex" xmlns:mc="http://schemas.openxmlformats.org/markup-compatibility/2006" xmlns:aink="http://schemas.microsoft.com/office/drawing/2016/ink" xmlns:am3d="http://schemas.microsoft.com/office/drawing/2017/model3d" xmlns:o="urn:schemas-microsoft-com:office:office" xmlns:oel="http://schemas.microsoft.com/office/2019/extlst" xmlns:r="http://schemas.openxmlformats.org/officeDocument/2006/relationships" xmlns:m="http://schemas.openxmlformats.org/officeDocument/2006/math" xmlns:v="urn:schemas-microsoft-com:vml" xmlns:wp14="http://schemas.microsoft.com/office/word/2010/wordprocessingDrawing" xmlns:wp="http://schemas.openxmlformats.org/drawingml/2006/wordprocessingDrawing" xmlns:w10="urn:schemas-microsoft-com:office:word" xmlns:w="http://schemas.openxmlformats.org/wordprocessingml/2006/main" xmlns:w14="http://schemas.microsoft.com/office/word/2010/wordml" xmlns:w15="http://schemas.microsoft.com/office/word/2012/wordml" xmlns:w16cei="http://schemas.microsoft.com/office/word/2026/wordml/cei" xmlns:w16cex="http://schemas.microsoft.com/office/word/2018/wordml/cex" xmlns:w16cid="http://schemas.microsoft.com/office/word/2016/wordml/cid" xmlns:w16="http://schemas.microsoft.com/office/word/2018/wordml" xmlns:w16du="http://schemas.microsoft.com/office/word/2023/wordml/word16du" xmlns:w16sdtdh="http://schemas.microsoft.com/office/word/2020/wordml/sdtdatahash" xmlns:w16sdtfl="http://schemas.microsoft.com/office/word/2024/wordml/sdtformatlock" xmlns:w16se="http://schemas.microsoft.com/office/word/2015/wordml/symex" xmlns:wpg="http://schemas.microsoft.com/office/word/2010/wordprocessingGroup" xmlns:wpi="http://schemas.microsoft.com/office/word/2010/wordprocessingInk" xmlns:wne="http://schemas.microsoft.com/office/word/2006/wordml" xmlns:wps="http://schemas.microsoft.com/office/word/2010/wordprocessingShape" mc:Ignorable="w14 w15 w16se w16cid w16 w16cex w16sdtdh w16sdtfl w16du wp14">
   <w:abstractNum w:abstractNumId="0" w15:restartNumberingAfterBreak="0">
     <w:nsid w:val="03613C8C"/>
     <w:multiLevelType w:val="multilevel"/>
@@ -5406,6 +5034,7 @@
   <w:style w:type="character" w:default="1" w:styleId="a0">
     <w:name w:val="Default Paragraph Font"/>
     <w:uiPriority w:val="1"/>
+    <w:semiHidden/>
     <w:unhideWhenUsed/>
   </w:style>
   <w:style w:type="table" w:default="1" w:styleId="a1">

</xml_diff>